<commit_message>
Refine Solar Geothermal and Innovations week
Co-authored-by: Cursor <cursoragent@cursor.com>
</commit_message>
<xml_diff>
--- a/production/activities/unit-02/solar-device-mini-investigation.docx
+++ b/production/activities/unit-02/solar-device-mini-investigation.docx
@@ -92,6 +92,17 @@
           <w:sz w:val="26"/>
         </w:rPr>
         <w:t>Question:  How does the amount of available light change what our solar device does?</w:t>
+      </w:r>
+    </w:p>
+    <w:p>
+      <w:pPr>
+        <w:spacing w:before="0" w:after="40"/>
+      </w:pPr>
+      <w:r>
+        <w:rPr>
+          <w:b/>
+        </w:rPr>
+        <w:t>Fair Test: Keep the SAME solar device and the SAME way of observing. We change ONLY the light.</w:t>
       </w:r>
     </w:p>
     <w:p>

</xml_diff>